<commit_message>
feat: add English Unit 3 Lesson 13 persuasive alternative materials, Year 5 Survey Detectives lesson, and project updates
</commit_message>
<xml_diff>
--- a/Units/English/English_Unit_3/Lesson_Plans/Lesson_13/Persuasive_Alternative/Lesson_13_Persuasive_Lucas_Organiser.docx
+++ b/Units/English/English_Unit_3/Lesson_Plans/Lesson_13/Persuasive_Alternative/Lesson_13_Persuasive_Lucas_Organiser.docx
@@ -130,6 +130,22 @@
               <w:t xml:space="preserve">You may point, speak, copy or ask someone to write.</w:t>
             </w:r>
           </w:p>
+          <w:p>
+            <w:pPr>
+              <w:spacing w:after="5" w:before="0" w:line="220" w:lineRule="auto"/>
+            </w:pPr>
+            <w:r>
+              <w:rPr>
+                <w:rFonts w:ascii="Arial" w:cs="Arial" w:eastAsia="Arial" w:hAnsi="Arial"/>
+                <w:b/>
+                <w:bCs/>
+                <w:color w:val="D8654F"/>
+                <w:sz w:val="20"/>
+                <w:szCs w:val="20"/>
+              </w:rPr>
+              <w:t xml:space="preserve">Choose one option in each row. Some choices do not fit the idea - be ready to say why.</w:t>
+            </w:r>
+          </w:p>
         </w:tc>
       </w:tr>
     </w:tbl>
@@ -147,7 +163,7 @@
           <w:sz w:val="22"/>
           <w:szCs w:val="22"/>
         </w:rPr>
-        <w:t xml:space="preserve">1  WHO needs it?</w:t>
+        <w:t xml:space="preserve">1  WHICH students?</w:t>
       </w:r>
     </w:p>
     <w:tbl>
@@ -181,9 +197,9 @@
             </w:tcBorders>
             <w:shd w:fill="EAF1F7" w:val="clear"/>
             <w:tcMar>
-              <w:top w:type="dxa" w:w="150"/>
+              <w:top w:type="dxa" w:w="125"/>
               <w:left w:type="dxa" w:w="100"/>
-              <w:bottom w:type="dxa" w:w="150"/>
+              <w:bottom w:type="dxa" w:w="125"/>
               <w:right w:type="dxa" w:w="100"/>
             </w:tcMar>
             <w:vAlign w:val="center"/>
@@ -198,10 +214,10 @@
                 <w:b/>
                 <w:bCs/>
                 <w:color w:val="20303C"/>
-                <w:sz w:val="27"/>
-                <w:szCs w:val="27"/>
-              </w:rPr>
-              <w:t xml:space="preserve">□ students who need a break</w:t>
+                <w:sz w:val="22"/>
+                <w:szCs w:val="22"/>
+              </w:rPr>
+              <w:t xml:space="preserve">□ sporty students who like to run and play</w:t>
             </w:r>
           </w:p>
         </w:tc>
@@ -216,9 +232,9 @@
             </w:tcBorders>
             <w:shd w:fill="EAF1F7" w:val="clear"/>
             <w:tcMar>
-              <w:top w:type="dxa" w:w="150"/>
+              <w:top w:type="dxa" w:w="125"/>
               <w:left w:type="dxa" w:w="100"/>
-              <w:bottom w:type="dxa" w:w="150"/>
+              <w:bottom w:type="dxa" w:w="125"/>
               <w:right w:type="dxa" w:w="100"/>
             </w:tcMar>
             <w:vAlign w:val="center"/>
@@ -233,10 +249,10 @@
                 <w:b/>
                 <w:bCs/>
                 <w:color w:val="20303C"/>
-                <w:sz w:val="27"/>
-                <w:szCs w:val="27"/>
-              </w:rPr>
-              <w:t xml:space="preserve">□ students who want to read</w:t>
+                <w:sz w:val="22"/>
+                <w:szCs w:val="22"/>
+              </w:rPr>
+              <w:t xml:space="preserve">□ students overwhelmed by the noisy oval</w:t>
             </w:r>
           </w:p>
         </w:tc>
@@ -251,9 +267,9 @@
             </w:tcBorders>
             <w:shd w:fill="EAF1F7" w:val="clear"/>
             <w:tcMar>
-              <w:top w:type="dxa" w:w="150"/>
+              <w:top w:type="dxa" w:w="125"/>
               <w:left w:type="dxa" w:w="100"/>
-              <w:bottom w:type="dxa" w:w="150"/>
+              <w:bottom w:type="dxa" w:w="125"/>
               <w:right w:type="dxa" w:w="100"/>
             </w:tcMar>
             <w:vAlign w:val="center"/>
@@ -268,10 +284,10 @@
                 <w:b/>
                 <w:bCs/>
                 <w:color w:val="20303C"/>
-                <w:sz w:val="27"/>
-                <w:szCs w:val="27"/>
-              </w:rPr>
-              <w:t xml:space="preserve">□ students who want to talk quietly</w:t>
+                <w:sz w:val="22"/>
+                <w:szCs w:val="22"/>
+              </w:rPr>
+              <w:t xml:space="preserve">□ students who would like to read</w:t>
             </w:r>
           </w:p>
         </w:tc>
@@ -285,10 +301,10 @@
         <w:rPr>
           <w:rFonts w:ascii="Arial" w:cs="Arial" w:eastAsia="Arial" w:hAnsi="Arial"/>
           <w:color w:val="20303C"/>
-          <w:sz w:val="28"/>
-          <w:szCs w:val="28"/>
-        </w:rPr>
-        <w:t xml:space="preserve">My noun group: students who ______________________________________________________</w:t>
+          <w:sz w:val="25"/>
+          <w:szCs w:val="25"/>
+        </w:rPr>
+        <w:t xml:space="preserve">My choice: ______________________________________________________________________</w:t>
       </w:r>
     </w:p>
     <w:p>
@@ -305,7 +321,7 @@
           <w:sz w:val="22"/>
           <w:szCs w:val="22"/>
         </w:rPr>
-        <w:t xml:space="preserve">2  WHAT will it have?</w:t>
+        <w:t xml:space="preserve">2  Help them do WHAT?</w:t>
       </w:r>
     </w:p>
     <w:tbl>
@@ -339,9 +355,9 @@
             </w:tcBorders>
             <w:shd w:fill="EAF1F7" w:val="clear"/>
             <w:tcMar>
-              <w:top w:type="dxa" w:w="150"/>
+              <w:top w:type="dxa" w:w="125"/>
               <w:left w:type="dxa" w:w="100"/>
-              <w:bottom w:type="dxa" w:w="150"/>
+              <w:bottom w:type="dxa" w:w="125"/>
               <w:right w:type="dxa" w:w="100"/>
             </w:tcMar>
             <w:vAlign w:val="center"/>
@@ -356,10 +372,10 @@
                 <w:b/>
                 <w:bCs/>
                 <w:color w:val="20303C"/>
-                <w:sz w:val="27"/>
-                <w:szCs w:val="27"/>
-              </w:rPr>
-              <w:t xml:space="preserve">□ two benches</w:t>
+                <w:sz w:val="25"/>
+                <w:szCs w:val="25"/>
+              </w:rPr>
+              <w:t xml:space="preserve">□ reset</w:t>
             </w:r>
           </w:p>
         </w:tc>
@@ -374,9 +390,9 @@
             </w:tcBorders>
             <w:shd w:fill="EAF1F7" w:val="clear"/>
             <w:tcMar>
-              <w:top w:type="dxa" w:w="150"/>
+              <w:top w:type="dxa" w:w="125"/>
               <w:left w:type="dxa" w:w="100"/>
-              <w:bottom w:type="dxa" w:w="150"/>
+              <w:bottom w:type="dxa" w:w="125"/>
               <w:right w:type="dxa" w:w="100"/>
             </w:tcMar>
             <w:vAlign w:val="center"/>
@@ -391,10 +407,10 @@
                 <w:b/>
                 <w:bCs/>
                 <w:color w:val="20303C"/>
-                <w:sz w:val="27"/>
-                <w:szCs w:val="27"/>
-              </w:rPr>
-              <w:t xml:space="preserve">□ a shaded space</w:t>
+                <w:sz w:val="25"/>
+                <w:szCs w:val="25"/>
+              </w:rPr>
+              <w:t xml:space="preserve">□ talk quietly</w:t>
             </w:r>
           </w:p>
         </w:tc>
@@ -409,9 +425,9 @@
             </w:tcBorders>
             <w:shd w:fill="EAF1F7" w:val="clear"/>
             <w:tcMar>
-              <w:top w:type="dxa" w:w="150"/>
+              <w:top w:type="dxa" w:w="125"/>
               <w:left w:type="dxa" w:w="100"/>
-              <w:bottom w:type="dxa" w:w="150"/>
+              <w:bottom w:type="dxa" w:w="125"/>
               <w:right w:type="dxa" w:w="100"/>
             </w:tcMar>
             <w:vAlign w:val="center"/>
@@ -426,10 +442,10 @@
                 <w:b/>
                 <w:bCs/>
                 <w:color w:val="20303C"/>
-                <w:sz w:val="27"/>
-                <w:szCs w:val="27"/>
-              </w:rPr>
-              <w:t xml:space="preserve">□ a quiet reading box</w:t>
+                <w:sz w:val="25"/>
+                <w:szCs w:val="25"/>
+              </w:rPr>
+              <w:t xml:space="preserve">□ play games</w:t>
             </w:r>
           </w:p>
         </w:tc>
@@ -443,10 +459,10 @@
         <w:rPr>
           <w:rFonts w:ascii="Arial" w:cs="Arial" w:eastAsia="Arial" w:hAnsi="Arial"/>
           <w:color w:val="20303C"/>
-          <w:sz w:val="28"/>
-          <w:szCs w:val="28"/>
-        </w:rPr>
-        <w:t xml:space="preserve">My noun group: a ________________________________________________________________</w:t>
+          <w:sz w:val="25"/>
+          <w:szCs w:val="25"/>
+        </w:rPr>
+        <w:t xml:space="preserve">My choice: ______________________________________________________________________</w:t>
       </w:r>
     </w:p>
     <w:p>
@@ -463,7 +479,7 @@
           <w:sz w:val="22"/>
           <w:szCs w:val="22"/>
         </w:rPr>
-        <w:t xml:space="preserve">3  WHERE will it go?</w:t>
+        <w:t xml:space="preserve">3  WHEN or where?</w:t>
       </w:r>
     </w:p>
     <w:tbl>
@@ -497,9 +513,9 @@
             </w:tcBorders>
             <w:shd w:fill="EAF1F7" w:val="clear"/>
             <w:tcMar>
-              <w:top w:type="dxa" w:w="150"/>
+              <w:top w:type="dxa" w:w="125"/>
               <w:left w:type="dxa" w:w="100"/>
-              <w:bottom w:type="dxa" w:w="150"/>
+              <w:bottom w:type="dxa" w:w="125"/>
               <w:right w:type="dxa" w:w="100"/>
             </w:tcMar>
             <w:vAlign w:val="center"/>
@@ -514,10 +530,10 @@
                 <w:b/>
                 <w:bCs/>
                 <w:color w:val="20303C"/>
-                <w:sz w:val="27"/>
-                <w:szCs w:val="27"/>
-              </w:rPr>
-              <w:t xml:space="preserve">□ beside the library</w:t>
+                <w:sz w:val="25"/>
+                <w:szCs w:val="25"/>
+              </w:rPr>
+              <w:t xml:space="preserve">□ at lunchtime</w:t>
             </w:r>
           </w:p>
         </w:tc>
@@ -532,9 +548,9 @@
             </w:tcBorders>
             <w:shd w:fill="EAF1F7" w:val="clear"/>
             <w:tcMar>
-              <w:top w:type="dxa" w:w="150"/>
+              <w:top w:type="dxa" w:w="125"/>
               <w:left w:type="dxa" w:w="100"/>
-              <w:bottom w:type="dxa" w:w="150"/>
+              <w:bottom w:type="dxa" w:w="125"/>
               <w:right w:type="dxa" w:w="100"/>
             </w:tcMar>
             <w:vAlign w:val="center"/>
@@ -549,10 +565,10 @@
                 <w:b/>
                 <w:bCs/>
                 <w:color w:val="20303C"/>
-                <w:sz w:val="27"/>
-                <w:szCs w:val="27"/>
-              </w:rPr>
-              <w:t xml:space="preserve">□ near the playground</w:t>
+                <w:sz w:val="25"/>
+                <w:szCs w:val="25"/>
+              </w:rPr>
+              <w:t xml:space="preserve">□ in the mornings</w:t>
             </w:r>
           </w:p>
         </w:tc>
@@ -567,9 +583,9 @@
             </w:tcBorders>
             <w:shd w:fill="EAF1F7" w:val="clear"/>
             <w:tcMar>
-              <w:top w:type="dxa" w:w="150"/>
+              <w:top w:type="dxa" w:w="125"/>
               <w:left w:type="dxa" w:w="100"/>
-              <w:bottom w:type="dxa" w:w="150"/>
+              <w:bottom w:type="dxa" w:w="125"/>
               <w:right w:type="dxa" w:w="100"/>
             </w:tcMar>
             <w:vAlign w:val="center"/>
@@ -584,10 +600,10 @@
                 <w:b/>
                 <w:bCs/>
                 <w:color w:val="20303C"/>
-                <w:sz w:val="27"/>
-                <w:szCs w:val="27"/>
-              </w:rPr>
-              <w:t xml:space="preserve">□ in another safe place</w:t>
+                <w:sz w:val="25"/>
+                <w:szCs w:val="25"/>
+              </w:rPr>
+              <w:t xml:space="preserve">□ on weekends</w:t>
             </w:r>
           </w:p>
         </w:tc>
@@ -601,10 +617,10 @@
         <w:rPr>
           <w:rFonts w:ascii="Arial" w:cs="Arial" w:eastAsia="Arial" w:hAnsi="Arial"/>
           <w:color w:val="20303C"/>
-          <w:sz w:val="28"/>
-          <w:szCs w:val="28"/>
-        </w:rPr>
-        <w:t xml:space="preserve">Place: __________________________________________________________________________</w:t>
+          <w:sz w:val="25"/>
+          <w:szCs w:val="25"/>
+        </w:rPr>
+        <w:t xml:space="preserve">My choice: ______________________________________________________________________</w:t>
       </w:r>
     </w:p>
     <w:p>
@@ -621,7 +637,7 @@
           <w:sz w:val="22"/>
           <w:szCs w:val="22"/>
         </w:rPr>
-        <w:t xml:space="preserve">4  BUILD the proposal</w:t>
+        <w:t xml:space="preserve">4  BUILD the reason</w:t>
       </w:r>
     </w:p>
     <w:tbl>
@@ -662,60 +678,60 @@
           </w:tcPr>
           <w:p>
             <w:pPr>
-              <w:spacing w:after="90" w:before="0" w:line="220" w:lineRule="auto"/>
-            </w:pPr>
-            <w:r>
-              <w:rPr>
-                <w:rFonts w:ascii="Arial" w:cs="Arial" w:eastAsia="Arial" w:hAnsi="Arial"/>
-                <w:b/>
-                <w:bCs/>
-                <w:color w:val="20303C"/>
-                <w:sz w:val="28"/>
-                <w:szCs w:val="28"/>
-              </w:rPr>
-              <w:t xml:space="preserve">Our school should make a quiet lunchtime zone.</w:t>
-            </w:r>
-          </w:p>
-          <w:p>
-            <w:pPr>
-              <w:spacing w:after="90" w:before="0" w:line="220" w:lineRule="auto"/>
-            </w:pPr>
-            <w:r>
-              <w:rPr>
-                <w:rFonts w:ascii="Arial" w:cs="Arial" w:eastAsia="Arial" w:hAnsi="Arial"/>
-                <w:color w:val="20303C"/>
-                <w:sz w:val="28"/>
-                <w:szCs w:val="28"/>
-              </w:rPr>
-              <w:t xml:space="preserve">Students who __________________________________________ could sit there.</w:t>
-            </w:r>
-          </w:p>
-          <w:p>
-            <w:pPr>
-              <w:spacing w:after="90" w:before="0" w:line="220" w:lineRule="auto"/>
-            </w:pPr>
-            <w:r>
-              <w:rPr>
-                <w:rFonts w:ascii="Arial" w:cs="Arial" w:eastAsia="Arial" w:hAnsi="Arial"/>
-                <w:color w:val="20303C"/>
-                <w:sz w:val="28"/>
-                <w:szCs w:val="28"/>
-              </w:rPr>
-              <w:t xml:space="preserve">The ______________________________ space could have ________________________.</w:t>
-            </w:r>
-          </w:p>
-          <w:p>
-            <w:pPr>
-              <w:spacing w:after="90" w:before="0" w:line="220" w:lineRule="auto"/>
-            </w:pPr>
-            <w:r>
-              <w:rPr>
-                <w:rFonts w:ascii="Arial" w:cs="Arial" w:eastAsia="Arial" w:hAnsi="Arial"/>
-                <w:color w:val="20303C"/>
-                <w:sz w:val="28"/>
-                <w:szCs w:val="28"/>
-              </w:rPr>
-              <w:t xml:space="preserve">It would give students a calm place to ____________________________________.</w:t>
+              <w:spacing w:after="45" w:before="0" w:line="220" w:lineRule="auto"/>
+            </w:pPr>
+            <w:r>
+              <w:rPr>
+                <w:rFonts w:ascii="Arial" w:cs="Arial" w:eastAsia="Arial" w:hAnsi="Arial"/>
+                <w:b/>
+                <w:bCs/>
+                <w:color w:val="20303C"/>
+                <w:sz w:val="25"/>
+                <w:szCs w:val="25"/>
+              </w:rPr>
+              <w:t xml:space="preserve">The quiet lunchtime zone would give</w:t>
+            </w:r>
+          </w:p>
+          <w:p>
+            <w:pPr>
+              <w:spacing w:after="45" w:before="0" w:line="220" w:lineRule="auto"/>
+            </w:pPr>
+            <w:r>
+              <w:rPr>
+                <w:rFonts w:ascii="Arial" w:cs="Arial" w:eastAsia="Arial" w:hAnsi="Arial"/>
+                <w:color w:val="20303C"/>
+                <w:sz w:val="25"/>
+                <w:szCs w:val="25"/>
+              </w:rPr>
+              <w:t xml:space="preserve">____________________________________________________________</w:t>
+            </w:r>
+          </w:p>
+          <w:p>
+            <w:pPr>
+              <w:spacing w:after="45" w:before="0" w:line="220" w:lineRule="auto"/>
+            </w:pPr>
+            <w:r>
+              <w:rPr>
+                <w:rFonts w:ascii="Arial" w:cs="Arial" w:eastAsia="Arial" w:hAnsi="Arial"/>
+                <w:color w:val="20303C"/>
+                <w:sz w:val="25"/>
+                <w:szCs w:val="25"/>
+              </w:rPr>
+              <w:t xml:space="preserve">a calmer place to ______________________________</w:t>
+            </w:r>
+          </w:p>
+          <w:p>
+            <w:pPr>
+              <w:spacing w:after="45" w:before="0" w:line="220" w:lineRule="auto"/>
+            </w:pPr>
+            <w:r>
+              <w:rPr>
+                <w:rFonts w:ascii="Arial" w:cs="Arial" w:eastAsia="Arial" w:hAnsi="Arial"/>
+                <w:color w:val="20303C"/>
+                <w:sz w:val="25"/>
+                <w:szCs w:val="25"/>
+              </w:rPr>
+              <w:t xml:space="preserve">__________________________________________.</w:t>
             </w:r>
           </w:p>
           <w:p>
@@ -728,10 +744,10 @@
                 <w:b/>
                 <w:bCs/>
                 <w:color w:val="20303C"/>
-                <w:sz w:val="28"/>
-                <w:szCs w:val="28"/>
-              </w:rPr>
-              <w:t xml:space="preserve">Please try this helpful change.</w:t>
+                <w:sz w:val="23"/>
+                <w:szCs w:val="23"/>
+              </w:rPr>
+              <w:t xml:space="preserve">This choice fits because ________________________________________________.</w:t>
             </w:r>
           </w:p>
         </w:tc>

</xml_diff>